<commit_message>
Revise VELT part one into twenty chapters and improve mobile reading
</commit_message>
<xml_diff>
--- a/downloads/VELT_bible.docx
+++ b/downloads/VELT_bible.docx
@@ -140,7 +140,7 @@
         <w:jc w:val="both"/>
       </w:pPr>
       <w:r>
-        <w:t>До этого разговора Макс не знает о систематических кражах и существовании огромной преступной сети. Ранние споры о платах, договоре и происхождении похожего решения для него остаются спорами с подрядчиком, в том числе о невыгодных, но с виду законных условиях. Нельзя задним числом сделать его осведомлённым соучастником или человеком, десятилетиями сознательно скрывавшим установленное преступление. Лев раньше замечает связь разрозненных событий и безуспешно пытается донести её до него.</w:t>
+        <w:t>До этого разговора Макс не знает о систематических кражах и существовании огромной преступной сети. В первой части нет замеченной героями подмены или сходной разработки конкурента. Утечки ранних лет происходили вне их знания; доказательства этого прошлого появятся позднее. Договор с внешним хранителем заключается во второй части и выглядит обычной законной услугой. Нельзя задним числом сделать его осведомлённым соучастником или человеком, десятилетиями сознательно скрывавшим установленное преступление. Лев раньше замечает связь разрозненных событий и безуспешно пытается донести её до него.</w:t>
       </w:r>
     </w:p>
     <w:p>
@@ -196,7 +196,7 @@
         <w:jc w:val="both"/>
       </w:pPr>
       <w:r>
-        <w:t>В раннем мире упомянуты приобретения Pear, Samsong, Motorilla, HuaWave и Xiaomee. Сохранять эти написания; не подменять их реальными брендами. В главе 9 NORD остаётся новым авторским названием отдельного небольшого производителя. Игровые показатели «45 устройств», 14,63 миллиона продаж и около 88,98 миллиарда долларов относятся к промежуточным этапам с неясной методикой подсчёта. Не выдавать их за финальный мировой итог и не путать с ценой продажи 1,4 триллиона.</w:t>
+        <w:t>В раннем мире упомянуты приобретения Pear, Samsong, Motorilla, HuaWave и Xiaomee. Сохранять эти написания; не подменять их реальными брендами. NORD — авторское название отдельного производителя; Сэм на выставке помогает VELT и не показывает скопированной разработки. Игровые показатели «45 устройств», 14,63 миллиона продаж и около 88,98 миллиарда долларов относятся к промежуточным этапам с неясной методикой подсчёта. Не выдавать их за финальный мировой итог и не путать с ценой продажи 1,4 триллиона.</w:t>
       </w:r>
     </w:p>
     <w:p>
@@ -228,7 +228,7 @@
         <w:jc w:val="both"/>
       </w:pPr>
       <w:r>
-        <w:t>Внешняя цель — сохранить независимость VELT. Внутренняя потребность — признать, что ответственность нельзя заменить личным мученичеством. Его ложное убеждение: если он возьмёт всю вину на себя и всё проконтролирует, люди рядом будут защищены. В первой части он удерживает зарплатный конверт, чтобы не остановить разработку. Во второй помогает людям и постепенно привыкает решать за них. В третьей скрывает доказательства ради безопасности расследования, но его обман становится удобен самой организации. В четвёртой возвращает людям свободу уйти и наконец уходит сам.</w:t>
+        <w:t>Внешняя цель — сохранить независимость VELT. Внутренняя потребность — признать, что ответственность нельзя заменить личным мученичеством. Его ложное убеждение: если он возьмёт всю вину на себя и всё проконтролирует, люди рядом будут защищены. В первой части едва выполняет обещание о пятничной зарплате и учится не распоряжаться общими домашними деньгами без Анны. Во второй помогает людям и постепенно привыкает решать за них. В третьей скрывает доказательства ради безопасности расследования, но его обман становится удобен самой организации. В четвёртой возвращает людям свободу уйти и наконец уходит сам.</w:t>
       </w:r>
     </w:p>
     <w:p>
@@ -236,7 +236,7 @@
         <w:jc w:val="both"/>
       </w:pPr>
       <w:r>
-        <w:t>Самая тяжёлая управленческая вина — договор раннего выживания: он подписал законно выглядевшую передачу эталонов внешнему «доверенному хранителю» и не дал команде участвовать в решении. Происхождение этого контрагента как звена преступной сети выясняется для него лишь после доказательств 2040 года. До этого он считает произошедшее тяжёлым договорным спором и принимает подготовленное внешними юристами объяснение. В главе 11 или следующей сцене обязательно показать такое частичное разрешение раннего эпизода: он не должен тридцать лет делать вид, что не заметил уже доказанную кражу. Его вина — чрезмерное доверие, уступленные права и отказ слушать людей, а не сознательное участие в преступлении. После продажи Макс также не становится невиновным святым: выбор покупателя и слабость гарантий остаются его решениями.</w:t>
+        <w:t>Его тяжёлая управленческая вина возникает постепенно: во второй части он разрешает внешнему центру хранить оригиналы, считает тревоги Льва частными спорами и продолжает доверять удобному посреднику. Это не тайная осведомлённость о преступной сети. В 2040 году доказательства впервые позволяют связать решение с реальными кражами. После продажи Макс также не становится безупречным: выбор покупателя и слабость гарантий остаются его решениями.</w:t>
       </w:r>
     </w:p>
     <w:p>
@@ -260,7 +260,7 @@
         <w:jc w:val="both"/>
       </w:pPr>
       <w:r>
-        <w:t>Снаружи хочет доказать, что способен делать собственные устройства, а не только чинить чужие. Внутри должен научиться отличать верность человеку от обязанности терпеть его решения. Его ошибка — хранить чужие тайны из благодарности. Он один раз сознательно подписывает непроверенную приёмку ради зарплаты матери, потом сам оставляет собственную подпись в пакете доказательств. Поступок не оправдывается бедностью, но становится понятен через сцену, а не авторский приговор.</w:t>
+        <w:t>Снаружи хочет доказать, что способен делать собственные устройства, а не только чинить чужие. Внутри должен научиться отличать верность человеку от обязанности терпеть его решения. Его ошибка — хранить чужие тайны из благодарности. Он не проверяет зимний запуск первого прибора; это приводит к травме Боба. Позднее не убирает собственные ошибки из истории, которую передаёт следствию. Поступок не оправдывается бедностью, но становится понятен через сцену, а не авторский приговор.</w:t>
       </w:r>
     </w:p>
     <w:p>
@@ -316,7 +316,7 @@
         <w:jc w:val="both"/>
       </w:pPr>
       <w:r>
-        <w:t>Первая ложная версия делает его главным продавцом технологии. В действительности раннюю передачу он совершил по поручению Макса, веря в договор хранения. Отдельная мелкая сделка Дэна с конкурентом действительно была: он продал собственную незапатентованную идею, не принадлежащую VELT, и не предупредил друзей. Это создаёт правдоподобное основание для подозрений. В третьей части Дэн спасает человека при пожаре в независимом хранилище, получает тяжёлые повреждения и спустя несколько глав умирает в больнице. Есть время на скуку ухода, надежду и разговоры, а не только зрелищная смерть.</w:t>
+        <w:t>В первой части Дэн создаёт собственный датчик протечки и договаривается о его продаже открыто, на условиях, заранее оформленных с VELT. В позднем расследовании обычная внешняя сделка становится удобной ложной версией, но читатель уже знает её человеческое происхождение. Пожар в третьей части приводит к тяжёлым травмам, затем к смерти Дэна после нескольких глав больничной надежды. Он получает долгую жизнь, любовь, смешные привычки и собственные решения прежде этой потери.</w:t>
       </w:r>
     </w:p>
     <w:p>
@@ -348,7 +348,7 @@
         <w:jc w:val="both"/>
       </w:pPr>
       <w:r>
-        <w:t>Родилась в 1988 году. Медсестра, будущая жена Льва, мать Сони. Появляется задолго до следственной линии, через обычную ошибку доставки и ссору из-за чужого пакета. Не умеет определять заговор по выражению лица. Ждёт от Льва конкретного ответа: когда он вернётся и кто заберёт дочь. В третьей части переезжает с Соней в безопасное жильё. Тяжёлый конфликт с Львом происходит из-за скрытого им риска, а не из-за нелепой ревности. У неё остаётся выбор жить отдельно; примирение не автоматическое.</w:t>
+        <w:t>Родилась в 1988 году. Медсестра, будущая жена Льва, мать Сони. Появляется задолго до следственной линии, через обычную ошибку доставки, чай у матери Льва и первое свидание в парке. Не умеет определять заговор по выражению лица. Ждёт от Льва конкретного ответа: когда он вернётся и кто заберёт дочь. В третьей части переезжает с Соней в безопасное жильё. Тяжёлый конфликт с Львом происходит из-за скрытого им риска, а не из-за нелепой ревности. У неё остаётся выбор жить отдельно; примирение не автоматическое.</w:t>
       </w:r>
     </w:p>
     <w:p>
@@ -380,7 +380,7 @@
         <w:jc w:val="both"/>
       </w:pPr>
       <w:r>
-        <w:t>Родился в 1978 году. Начальник охраны VELT во время зрелой компании. Прямая речь, больное колено, привычка записывать всё сразу. На групповом фото стоит так, чтобы закрыть подчинённого от ветра; сперва это выглядит как конспирация. Честен в ключевом деле, но однажды скрыл дисциплинарный проступок своего заместителя и тем позволил шантаж. Не вся охрана принадлежит организации. В третьей части Марк теряет работу и репутацию, даёт показания против знакомых, выживает. Его реабилитация не отменяет сделанную уступку.</w:t>
+        <w:t>Родился в 1978 году. Начальник охраны VELT во время зрелой компании. Прямая речь, больное колено, привычка записывать всё сразу. На групповом фото закрывает подчинённого от ветра; смысл снимка определяется поздней проверкой, а не авторским намёком на заговор. Честен в ключевом деле, но однажды скрыл дисциплинарный проступок своего заместителя и тем позволил шантаж. Не вся охрана принадлежит организации. В третьей части Марк теряет работу и репутацию, даёт показания против знакомых, выживает. Его реабилитация не отменяет сделанную уступку.</w:t>
       </w:r>
     </w:p>
     <w:p>
@@ -516,7 +516,7 @@
         <w:jc w:val="both"/>
       </w:pPr>
       <w:r>
-        <w:t>Первая улика — маленькая метка Льва на отремонтированной плате под покрытием; нельзя позднее превратить её в скрытый электронный трекер. Разница между внешней наклейкой и внутренней меткой позволяет установить подмену. Второй мотив — две подписи на форме отправки; одна относится к физической выдаче, другая к юридическому разрешению. Третья улика — неполный пакет страниц, отсутствующая страница двенадцать и оставшаяся на ней продавленная запись. Сам по себе номер страницы ничего не доказывает; смысл приобретается с цепочкой хранения.</w:t>
+        <w:t>Первая часть — основание и взросление. Пролог показывает решение Макса снять мастерскую, домашние деньги и право Анны участвовать в решении. Флешфорварда с компроматом нет. Метка в главе 2 — обычная отметка проверенного ремонта, не будущий чудесный ключ к делу. Ошибка холодного запуска принадлежит самой команде. Сэм из NORD — нормальный коллега, не похититель. Пит погибает в дорожной аварии, не организованной против VELT.</w:t>
       </w:r>
     </w:p>
     <w:p>
@@ -524,7 +524,7 @@
         <w:jc w:val="both"/>
       </w:pPr>
       <w:r>
-        <w:t>Из пролога читатель знает, что Лев принесёт Максу тяжёлую правду, но не знает, какую часть этой правды Макс уже носит в себе. В первой части подозрения переходят от Дэна к Роману и лишь затем к подписи Макса. Во второй успех делает старые сомнения неудобными; доказательства исчезают по одному, а не одним нажатием волшебной кнопки. Третья часть заставляет менять действия, а не просто версии. Лев передаёт полный пакет, Макс нанимает Олега, смерть запускает борьбу за независимое расследование. Четвёртая часть отвечает на вопросы о кражах и оставляет вопрос об исчезновении открытым.</w:t>
+        <w:t>Во второй части первые сомнения появляются после того, как читатель увидел ценность успеха. Сначала исчезнувшее имя автора, затем несогласованный доступ, потом несоответствие конкретного оригинала. Нина требует обычной проверки, не объявляет преступный заговор по похожему корпусу. Частные ответы убедительны настолько, что Макс их принимает; Лев постепенно замечает повторяющуюся цепочку. От раннего архива 2007–2017 годов остаются копии, расходы и показания бывших работников. Их происхождение устанавливают позднее, не приписывают Максу знание задним числом.</w:t>
       </w:r>
     </w:p>
     <w:p>
@@ -532,7 +532,7 @@
         <w:jc w:val="both"/>
       </w:pPr>
       <w:r>
-        <w:t>Кровавый знак — незамкнутый прямоугольник с короткой внутренней чертой. В ранних бумагах похожая форма встречается как дешёвый служебный штамп, но сходство не подаётся как установленная связь. Символ на месте убийства подтверждается только судебной экспертизой. В тексте не повторять его каждые несколько страниц ради дешёвого предзнаменования.</w:t>
+        <w:t>Пакет 2040 года содержит видео, платежи, документы, фотографии всей охраны и объяснение происхождения каждого материала. Фотография доказывает присутствие, а не вину. Герои проверяют альтернативы. В третьей части новое знание меняет действие и создаёт цену; после убийства Олега нельзя вернуться к прежнему рабочему дню. В середине четвёртой части найдены оригиналы, но исчезновение людей остаётся неразгаданным до конца.</w:t>
       </w:r>
     </w:p>
     <w:p>
@@ -540,7 +540,7 @@
         <w:jc w:val="both"/>
       </w:pPr>
       <w:r>
-        <w:t>Меры против неправдоподобного всемогущества организации: исполнители ошибаются; разные звенья не знают друг друга; доказательства приходится физически получать; у организации нет доступа ко всем личным разговорам; не вся неудача VELT организована извне. Значительная часть бед — собственные решения героев, рыночные ошибки, болезни и несовместимые желания.</w:t>
+        <w:t>Кровавый знак — незамкнутый прямоугольник с внутренней чертой. Он появляется как след на месте убийства, а не как повторяющаяся декорация первой части. Его происхождение и материал устанавливаются расследованием. У организации нет доступа ко всем разговорам. Исполнители ошибаются, разные звенья знают разное, часть бед VELT вызвана рынком и решениями героев.</w:t>
       </w:r>
     </w:p>
     <w:p>
@@ -572,7 +572,7 @@
         <w:jc w:val="both"/>
       </w:pPr>
       <w:r>
-        <w:t>Первая часть охватывает основание и тяжёлое взросление VELT до порога золотой эры. Её эмоциональный центр — право на собственную работу. Читатель должен успеть полюбить людей раньше, чем узнает масштаб хищений. Внутренняя структура: знакомство и работа → первое доверие → первая подмена → оплаченный компромисс → короткое восстановление, которое ещё не является победой.</w:t>
+        <w:t>Двадцать глав написаны. Основная причинная цепочка: оплаченная работа → общая разработка → ошибка и ответственность → рост семьи → первый телефон → потеря → медленное восстановление → новая эпоха. В первой части нет замеченной героями кражи и детективного расследования. Интерес держат характеры, желания и цена решений. Утечки канонических ранних лет выясняются позднее.</w:t>
       </w:r>
     </w:p>
     <w:p>
@@ -580,7 +580,7 @@
         <w:jc w:val="both"/>
       </w:pPr>
       <w:r>
-        <w:t>1. «Свет над столом». Лев приходит за заработанными деньгами в закрывшуюся мастерскую и встречает Макса, который предлагает оплачиваемую пробную работу. Сотрудничество начинается с точной цены, а не с обещания величия. В конце Лев обнаруживает, что прежняя мастерская избавилась от его имени раньше, чем от долгов.</w:t>
+        <w:t>1. «Свет над столом». Лев теряет место в закрывшейся мастерской и получает у Макса оплачиваемую пробную работу. Представлены его возраст, мать и необходимость заработка.</w:t>
       </w:r>
     </w:p>
     <w:p>
@@ -588,7 +588,7 @@
         <w:jc w:val="both"/>
       </w:pPr>
       <w:r>
-        <w:t>2. «Два ключа». В пустом помещении новой компании Ева и Дэн пытаются запустить ремонтный заказ. Лев получает свой ключ и оставляет внутреннюю метку на плате. Вечером Макс обещает заплатить всем раньше, чем себе, а Анна спрашивает, что останется на жильё.</w:t>
+        <w:t>2. «Два ключа». Первый ремонтный заказ знакомит с Евой и устройством команды. Лев получает ключ; договорённость о зарплате конкретна.</w:t>
       </w:r>
     </w:p>
     <w:p>
@@ -596,7 +596,7 @@
         <w:jc w:val="both"/>
       </w:pPr>
       <w:r>
-        <w:t>3. «Голубая чашка». Работа начинает приносить маленькую выручку, на один день люди чувствуют себя командой. Попытка заказать собственную плату приводит к неожиданной цене. Гость забирает образец для проверки, и герой впервые замечает две разные формы учёта.</w:t>
+        <w:t>3. «Голубая чашка». После ремонта на складе Боба возникает задача собственного прибора. Много неудачных попыток приводят к первому повторяемому результату.</w:t>
       </w:r>
     </w:p>
     <w:p>
@@ -604,7 +604,7 @@
         <w:jc w:val="both"/>
       </w:pPr>
       <w:r>
-        <w:t>4. «Чужая коробка». Лев получает якобы тот же образец обратно и находит несовпадение внутри корпуса. Макс отправляет его проверить ошибку у подрядчика. Дэн оказывается последним, кто действительно выносил вещь из мастерской.</w:t>
+        <w:t>4. «На настоящем складе». Макс обещает слишком короткую установку. Проверка проваливается; команда возвращается после подготовки и договаривается о честных ограничениях.</w:t>
       </w:r>
     </w:p>
     <w:p>
@@ -612,7 +612,7 @@
         <w:jc w:val="both"/>
       </w:pPr>
       <w:r>
-        <w:t>5. «Выдать под подпись». Лев и Дэн едут возвращать своё; архивный работник утверждает, что такой вещи у них никогда не было. Дружеская ссора даёт первую реальную трещину. В конце находится разрешение с подписью Макса.</w:t>
+        <w:t>5. «За наш счёт». Первая попытка большого заказа не выдерживает расчёта. Нина помогает договориться о долях, труде и самостоятельном датчике Дэна.</w:t>
       </w:r>
     </w:p>
     <w:p>
@@ -620,7 +620,7 @@
         <w:jc w:val="both"/>
       </w:pPr>
       <w:r>
-        <w:t>6. «День зарплаты». Макс должен рассказать сотрудникам об убыточном договоре хранения и выбирает неполную правду. Лев подписывает приёмку ради зарплаты. Дома он не может объяснить матери, почему деньги получены слишком легко.</w:t>
+        <w:t>6. «День зарплаты». Задержка оплаты ставит под угрозу зарплату. Макс спрашивает Анну о домашних деньгах, собирает оплату готовых работ; команда вводит еженедельную проверку остатка.</w:t>
       </w:r>
     </w:p>
     <w:p>
@@ -628,7 +628,7 @@
         <w:jc w:val="both"/>
       </w:pPr>
       <w:r>
-        <w:t>7. «Место для стула». Анна и Макс пытаются устроить обычный вечер, а Ева вытаскивает компанию из сорванной поставки. Дэн показывает Льву собственную разработку вне VELT. Лев узнаёт, что по этой разработке уже была отдельная сделка.</w:t>
+        <w:t>7. «Место для стула». Сорванная поставка вторгается в домашний ужин Макса. Анна получает право сердиться без роли врага компании; знакомство с Леной и Питом.</w:t>
       </w:r>
     </w:p>
     <w:p>
@@ -636,7 +636,7 @@
         <w:jc w:val="both"/>
       </w:pPr>
       <w:r>
-        <w:t>8. «Возврат без чека». Сбой у небольшого заказчика грозит травмами и закрытием компании. Лев отказывается скрыть дефект и ремонтирует всю партию. Подмена оказывается важнее плохой детали; читатель получает технически понятный результат без лекции об электронике.</w:t>
+        <w:t>8. «Возврат без чека». Боб травмирован, прибор не предупредил о неисправности на холоде. Ошибка собственная. Отзыв, затраты и извинения восстанавливают рабочее доверие.</w:t>
       </w:r>
     </w:p>
     <w:p>
@@ -644,7 +644,7 @@
         <w:jc w:val="both"/>
       </w:pPr>
       <w:r>
-        <w:t>9. «На чужом столе». На выставке команда видит знакомое решение в чужом устройстве. У неё нет убедительной цепочки авторства. Макс учится выступать на публике и впервые сознательно произносит фразу, которую инженеры дома не примут.</w:t>
+        <w:t>9. «Место у прохода». Неудачное место и проблема питания на выставке. Сэм из NORD помогает. Макс учится говорить правду об ограничениях и ошибках.</w:t>
       </w:r>
     </w:p>
     <w:p>
@@ -652,7 +652,7 @@
         <w:jc w:val="both"/>
       </w:pPr>
       <w:r>
-        <w:t>10. «Третья кружка». Маленький бытовой праздник Евы и Дэна снимает напряжение. Лев пытается извиниться, но случайно узнаёт о старой передаче документов. Устанавливается, что подозрение и реальное предательство — разные вещи.</w:t>
+        <w:t>10. «Третья кружка». Контакты выставки дают небольшие заказы. Самостоятельная работа Дэна и новоселье Евы сближают людей. Любовь начинается в бытовом жесте.</w:t>
       </w:r>
     </w:p>
     <w:p>
@@ -660,7 +660,7 @@
         <w:jc w:val="both"/>
       </w:pPr>
       <w:r>
-        <w:t>11. «Лишняя смена». Компания проходит тяжёлый сезон заказов. Знакомство Льва с Верой начинается из-за ошибки доставки. Макс отменяет её обоснованную претензию как мелочь и впервые выглядит для Льва человеком по другую сторону стола.</w:t>
+        <w:t>11. «Лишняя смена». Юридические условия нового заказа и вечная переработка. Ошибка доставки знакомит Льва с Верой; свидание открывает жизнь за пределами мастерской.</w:t>
       </w:r>
     </w:p>
     <w:p>
@@ -668,7 +668,7 @@
         <w:jc w:val="both"/>
       </w:pPr>
       <w:r>
-        <w:t>12. «Сухие носки». Мила учится ходить, а её отец пропускает обычный семейный день. Отдельная ночь ремонта приносит настоящий успех. Ева обнаруживает убыток, который нельзя спрятать следующей продажей.</w:t>
+        <w:t>12. «Сухие носки». Рождение Милы весной 2010 года, усталость Анны и первый год жизни дочери. Лев с Верой учатся договариваться о времени. Удачный заказ прачечной даёт новые стулья.</w:t>
       </w:r>
     </w:p>
     <w:p>
@@ -676,7 +676,7 @@
         <w:jc w:val="both"/>
       </w:pPr>
       <w:r>
-        <w:t>13. «Человек из банка». Роман предлагает реальное спасение через внешний капитал. Сотрудники спорят о доле и независимости. Условие хранения эталонов возвращается в более сложной форме.</w:t>
+        <w:t>13. «Человек из банка». Нина приводит Романа. Кредит на маленькие партии, найм Ильи, потеря убыточного заказа. Живая линия больного сына Романа предшествует его будущему нравственному падению.</w:t>
       </w:r>
     </w:p>
     <w:p>
@@ -684,7 +684,7 @@
         <w:jc w:val="both"/>
       </w:pPr>
       <w:r>
-        <w:t>14. «То что можно забрать». Из VELT уходит талантливый инженер с собственной работой, и Макс принимает это за измену. Лев защищает право уйти. Кто-то пользуется законным увольнением, чтобы вынести принадлежащее компании.</w:t>
+        <w:t>14. «То что можно забрать». Илья законно уходит. Компания учится распределять нагрузку вместо обвинений. Лев и Вера ждут ребёнка; он впервые выполняет право уйти вовремя.</w:t>
       </w:r>
     </w:p>
     <w:p>
@@ -692,7 +692,7 @@
         <w:jc w:val="both"/>
       </w:pPr>
       <w:r>
-        <w:t>15. «Снег в вентиляции». Поломка здания заставляет работать дома и объединяет семьи. На короткое время возникает настоящий общий дом. В чужом шкафу Лев находит экземпляр страницы, которую считал потерянной.</w:t>
+        <w:t>15. «Снег в вентиляции». Рождение Сони зимой 2014 года совпадает с аварией отопления. Пит помогает команде, коллеги отпускают Льва. Отдельная суббота отца с ребёнком делает заботу поступком.</w:t>
       </w:r>
     </w:p>
     <w:p>
@@ -700,7 +700,7 @@
         <w:jc w:val="both"/>
       </w:pPr>
       <w:r>
-        <w:t>16. «Без прибыли». Тяжёлый финансовый год показан через просроченные счета, а не через монтаж заголовков. Вера сообщает Льву о будущем ребёнке. Он впервые отказывается от ночной работы и получает за это упрёк.</w:t>
+        <w:t>16. «Пока не хватает». Середина тяжёлого десятилетия: рост выручки не стал прибылью. Отказ от опасного большого заказа. Свадьба Дэна и Евы имеет собственную радость. Возникает задача телефона.</w:t>
       </w:r>
     </w:p>
     <w:p>
@@ -708,7 +708,7 @@
         <w:jc w:val="both"/>
       </w:pPr>
       <w:r>
-        <w:t>17. «Первая очередь». VELT завершает первый самостоятельный массовый продукт, который всё ещё плохо продаётся. Рабочие отзывают опасную партию. Макс теряет контракт, но впервые позволяет людям присутствовать при решении.</w:t>
+        <w:t>17. «Первая очередь». Подготовка первой VELT Nova занимает больше года: опросы, внешняя сборка, неудобные крепления, реальные проверки. Маленькая очередь не скрывает слабые продажи.</w:t>
       </w:r>
     </w:p>
     <w:p>
@@ -716,7 +716,7 @@
         <w:jc w:val="both"/>
       </w:pPr>
       <w:r>
-        <w:t>18. «Двенадцатая страница». Ева сопоставляет формы выдачи и замечает отсутствие одного юридического листа. Макс признаёт невыгодное раннее условие и показывает принятое им правовое объяснение отправок. Лев не считает это объяснение достаточным и сохраняет копию. Подтверждённого знания о преступной сети у Макса ещё нет.</w:t>
+        <w:t>18. «Номер в телефоне». В конце кризисного десятилетия Пит гибнет в аварии. Лена переживает потерю не одним эпизодом. Сохранение его фотографий меняет внимание инженеров к человеку, а не к рекламе.</w:t>
       </w:r>
     </w:p>
     <w:p>
@@ -724,7 +724,7 @@
         <w:jc w:val="both"/>
       </w:pPr>
       <w:r>
-        <w:t>19. «Тёплая вода». После десятилетия низких доходов семья Льва впервые может планировать следующий месяц. Примирение с Дэном происходит за обычным ремонтом квартиры. Макс получает предложение, которое могло бы закончить их независимость сразу.</w:t>
+        <w:t>19. «Тёплая вода». Восстановление 2018–2021 годов. Семейная поездка к озеру не отменяет работы и памяти. Обратная связь покупателя приводит к замыслу VELT ARC.</w:t>
       </w:r>
     </w:p>
     <w:p>
@@ -732,7 +732,7 @@
         <w:jc w:val="both"/>
       </w:pPr>
       <w:r>
-        <w:t>20. «Свои имена». Команда отказывается от продажи по частям и выпускает действительно новое решение. Отдельная сцена отмечает новую эпоху 2022 года. Восстановление занимает годы, показанные через несколько полноценных сцен. Часть заканчивается перед технологическим лидерством: на новой двери каждый пишет своё имя, а Макс оставляет место для следующих людей.</w:t>
+        <w:t>20. «Свои имена». Новая эпоха 2022 года, затем несколько лет развития. Четырнадцатилетняя Мила помогает читать обращения. Отказ от дробящей компанию сделки, выпуск ARC, ясная работа с ошибками. Порог большого спроса, без раскрытия заговора.</w:t>
       </w:r>
     </w:p>
     <w:p>
@@ -748,7 +748,7 @@
         <w:jc w:val="both"/>
       </w:pPr>
       <w:r>
-        <w:t>Золотая эра начинается не с лозунга, а с того, что компания может выполнить прежние обещания. Цена успеха сначала почти приятна: хорошие кабинеты, дома, стабильность детей. Угроза растёт в документах и привычках, пока герои имеют убедительные причины считать её случайностью.</w:t>
+        <w:t>Сначала читатель проживает успех и любовь, затем замечает несовпадения. Часть охватывает золотую эру от 2026 года к порогу 2040-го. Личные ветви имеют собственные сцены и последствия, а улики накапливаются, не превращая каждый бытовой предмет в угрозу.</w:t>
       </w:r>
     </w:p>
     <w:p>
@@ -756,7 +756,7 @@
         <w:jc w:val="both"/>
       </w:pPr>
       <w:r>
-        <w:t>21. «Очередь до угла». Первый большой выпуск. Лев находит среди покупателей человека, которому когда-то бесплатно чинил старое устройство, и впервые чувствует масштаб собственного труда.</w:t>
+        <w:t>21. «Очередь до угла». Начало золотой эры 2026 года через большой спрос, рабочий день сотрудников и радость семей. Лев узнаёт покупателя из прежнего ремонта.</w:t>
       </w:r>
     </w:p>
     <w:p>
@@ -764,7 +764,7 @@
         <w:jc w:val="both"/>
       </w:pPr>
       <w:r>
-        <w:t>22. «Комната с окном». Новый офис разводит сотрудников по этажам. Ева замечает, что на производственное решение теперь трудно получить прямой ответ. Марк принимает охрану и меняет простые правила доступа.</w:t>
+        <w:t>22. «Комната с окном». Новый офис, разные этажи, трудность сохранить прямой разговор. Марк вводит понятные правила доступа. Комфорт имеет настоящую ценность.</w:t>
       </w:r>
     </w:p>
     <w:p>
@@ -772,7 +772,7 @@
         <w:jc w:val="both"/>
       </w:pPr>
       <w:r>
-        <w:t>23. «Свой выходной». Семьи едут к воде. Вера и Анна впервые говорят без мужей. Счастливый эпизод получает самостоятельную ценность и закладывает конкретное место будущего покоя.</w:t>
+        <w:t>23. «Свой выходной». Возвращение к озеру. Взрослеющие дочери получают собственные желания. Анна и Вера говорят о работе, которой не управляют их мужья.</w:t>
       </w:r>
     </w:p>
     <w:p>
@@ -780,7 +780,7 @@
         <w:jc w:val="both"/>
       </w:pPr>
       <w:r>
-        <w:t>24. «Витрина». Конкурент выпускает похожее решение слишком быстро. Нина требует доказательств происхождения, обнаруживает разрывы архива. Успешный запуск отвлекает Макса от неудобного разговора.</w:t>
+        <w:t>24. «Витрина». Первые сомнения: в публикации поставщика исчезает имя автора узла. Нина находит правдоподобное объяснение, которое устраняет только часть вопросов.</w:t>
       </w:r>
     </w:p>
     <w:p>
@@ -788,7 +788,7 @@
         <w:jc w:val="both"/>
       </w:pPr>
       <w:r>
-        <w:t>25. «Подарок». Дэн и Ева устраивают небольшую свадьбу или регистрацию без представления для компании. Роман дарит дорогую вещь, которую нельзя принять без ощущения долга.</w:t>
+        <w:t>25. «Общая работа». Приобретение Pear. Взрослая Мила знакомится с Алексом, инженером из присоединённой команды. Их взаимный интерес не делает ни одного шпионом.</w:t>
       </w:r>
     </w:p>
     <w:p>
@@ -796,7 +796,7 @@
         <w:jc w:val="both"/>
       </w:pPr>
       <w:r>
-        <w:t>26. «Новая смена». В команду приходят люди, которым старая мастерская кажется мифом. Лев понимает, что его дружба с основателем несправедлива к молодым коллегам.</w:t>
+        <w:t>26. «Новая смена». Новые коллеги не обязаны верить легенде о мастерской. Лев помогает человеку, которого сначала оценил слишком быстро; Мила видит другую сторону привилегий.</w:t>
       </w:r>
     </w:p>
     <w:p>
@@ -804,7 +804,7 @@
         <w:jc w:val="both"/>
       </w:pPr>
       <w:r>
-        <w:t>27. «Вторая копия». Проверка архива находит очень аккуратную подмену. Том пока не появляется: исследование ведут сотрудники VELT и независимая лаборатория. Нина требует сохранять цепочку доступа.</w:t>
+        <w:t>27. «Вторая копия». Нина обнаруживает несоответствие оригинала и рабочего экземпляра. Сначала проверяют ошибку учёта. Макс получает ограниченное техническое объяснение, а не доказательство преступления.</w:t>
       </w:r>
     </w:p>
     <w:p>
@@ -812,7 +812,7 @@
         <w:jc w:val="both"/>
       </w:pPr>
       <w:r>
-        <w:t>28. «Место в первом ряду». Макс становится публичным лицом. Мила отказывается участвовать в презентации семьи. Домашний конфликт не решается подарком.</w:t>
+        <w:t>28. «Место в первом ряду». Публичный успех VELT ARC и Tab. Мила отказывается изображать счастливую семью на презентации. Между Ниной и Марком возникает близость после обычного совместного вечера.</w:t>
       </w:r>
     </w:p>
     <w:p>
@@ -820,7 +820,7 @@
         <w:jc w:val="both"/>
       </w:pPr>
       <w:r>
-        <w:t>29. «Чужая заслуга». Лев получает премию за работу, в которой существенная доля принадлежала ушедшему сотруднику. Он публично называет соавтора и портит подготовленный сценарий.</w:t>
+        <w:t>29. «Чужая заслуга». Лев называет забытых соавторов премии и нарушает сценарий. Мила и Алекс спорят о судьбе Pear; первое свидание не решает профессионального конфликта.</w:t>
       </w:r>
     </w:p>
     <w:p>
@@ -828,7 +828,7 @@
         <w:jc w:val="both"/>
       </w:pPr>
       <w:r>
-        <w:t>30. «Короткая поездка». Знакомство с Виктором проходит в обыденной деловой обстановке. Он предлагает полезную архивную услугу и не демонстрирует зловещих привычек.</w:t>
+        <w:t>30. «Короткая поездка». Виктор предлагает архивирование. Проверка компании выглядит благополучной; Макс подписывает ограниченный договор, Нина фиксирует ограничения. Роман позднее обеспечивает обход этих правил.</w:t>
       </w:r>
     </w:p>
     <w:p>
@@ -836,7 +836,7 @@
         <w:jc w:val="both"/>
       </w:pPr>
       <w:r>
-        <w:t>31. «Оставить включённым». Смерть матери Льва от естественных причин останавливает карьерный ритм. Макс приходит помочь, но пытается руководить даже похоронами. Вера обозначает границу.</w:t>
+        <w:t>31. «Оставить включённым». Естественная смерть матери Льва. Потеря остаётся семейной, не частью заговора. Макс неуместно пытается организовать всё, Вера обозначает границу.</w:t>
       </w:r>
     </w:p>
     <w:p>
@@ -844,7 +844,7 @@
         <w:jc w:val="both"/>
       </w:pPr>
       <w:r>
-        <w:t>32. «Незакрытый счёт». Ева обнаруживает оплату отправки из старого договора, хотя услуга будто давно отменена. Роман объясняет это бухгалтерской инерцией; его объяснение частично правдиво.</w:t>
+        <w:t>32. «Незакрытый счёт». Ева находит оплату старых передач и узнаёт о ранних архивах 2007–2017 годов. Пока это след расходов, не доказанная кража; читатель понимает предел знания каждого.</w:t>
       </w:r>
     </w:p>
     <w:p>
@@ -852,7 +852,7 @@
         <w:jc w:val="both"/>
       </w:pPr>
       <w:r>
-        <w:t>33. «Выключенный микрофон». Неудачная презентация превращается в честный разговор с покупателями. Радость от исправленной ошибки сближает прежнюю команду на один вечер.</w:t>
+        <w:t>33. «Выключенный микрофон». Сбой презентации ведёт к открытому разговору с покупателями. Тёплый вечер команды. Нина и Марк начинают скрытые отношения и откладывают разговор о служебных ограничениях.</w:t>
       </w:r>
     </w:p>
     <w:p>
@@ -860,7 +860,7 @@
         <w:jc w:val="both"/>
       </w:pPr>
       <w:r>
-        <w:t>34. «Общий снимок». Служебная фотосъёмка охраны кажется бытовой сценой. Позже именно полнота этих фотографий позволит проверить, кто действительно был на смене.</w:t>
+        <w:t>34. «Общий снимок». Фотографирование всей охраны по служебной задаче. Соня, уже взрослая, знакомится с Кириллом на общем городском проекте. Отец Кирилла — Павел.</w:t>
       </w:r>
     </w:p>
     <w:p>
@@ -868,7 +868,7 @@
         <w:jc w:val="both"/>
       </w:pPr>
       <w:r>
-        <w:t>35. «Там где было имя». Из публикации исчезает имя независимого автора, связанного с чужой компанией. Мила помогает найти бумажную версию. Масштаб дела впервые выходит за VELT.</w:t>
+        <w:t>35. «Там где было имя». Мила и Алекс находят независимую бумажную публикацию автора из другой компании. Важна не похожая схема, а несовместимое происхождение конкретного комплекта.</w:t>
       </w:r>
     </w:p>
     <w:p>
@@ -876,7 +876,7 @@
         <w:jc w:val="both"/>
       </w:pPr>
       <w:r>
-        <w:t>36. «Неправильный отпуск». Анна уезжает одна после того, как Макс опять решает всё за неё. Успех компании не приносит ему права отменить её выбор.</w:t>
+        <w:t>36. «Неправильный отпуск». Анна уезжает одна. В отсутствие ясности Макс сближается с Асей и скрывает эмоциональную близость. Он сам сообщает об этом; Анна вправе жить отдельно.</w:t>
       </w:r>
     </w:p>
     <w:p>
@@ -884,7 +884,7 @@
         <w:jc w:val="both"/>
       </w:pPr>
       <w:r>
-        <w:t>37. «Доступ временно закрыт». Марк блокирует проход Льва на законном основании. Герой учится, что личное доверие не заменяет общий порядок; при этом настоящий нарушитель имеет другой вход.</w:t>
+        <w:t>37. «Доступ временно закрыт». Марк по правилам ограничивает проход Льва, при этом обнаруживается доступ посредника в обход обычного журнала. Нина обязана раскрыть личную связь и отойти от проверки Марка.</w:t>
       </w:r>
     </w:p>
     <w:p>
@@ -892,7 +892,7 @@
         <w:jc w:val="both"/>
       </w:pPr>
       <w:r>
-        <w:t>38. «Два автора». Дэн предъявляет доказательство своей ранней независимой работы. Лев извиняется за старую уверенность, но замечает в прилагаемой бумаге знакомую форму хранения.</w:t>
+        <w:t>38. «Два автора». Дэн показывает происхождение своей независимой идеи. Старое подозрение не становится оправданием настоящего канала передачи. Алекс признаёт участие своей группы в неверном оформлении работы и рискует отношениями с Милой.</w:t>
       </w:r>
     </w:p>
     <w:p>
@@ -900,7 +900,7 @@
         <w:jc w:val="both"/>
       </w:pPr>
       <w:r>
-        <w:t>39. «Чужие дети». Вводится семья Павла. Хорошая школа и удобное жильё имеют цену зависимости. Отец пытается понять, почему обычный отпуск нуждается в разрешении работодателя.</w:t>
+        <w:t>39. «Чужие дети». Павел, Лиза и взрослый Кирилл живут нормальной семьёй, но зависят от работодателя. Соня узнаёт часть ограничений от любимого и не превращает его доверие в донос.</w:t>
       </w:r>
     </w:p>
     <w:p>
@@ -908,7 +908,7 @@
         <w:jc w:val="both"/>
       </w:pPr>
       <w:r>
-        <w:t>40. «Дверь изнутри». Лев получает запись вывоза оригинала; внутренняя проверка пытается погасить тревогу. Он отказывается сразу идти к Максу, пока не соберёт пакет, который нельзя отвергнуть дружеским обещанием.</w:t>
+        <w:t>40. «Дверь изнутри». К концу 2030-х Лев получает проверяемую запись вывоза оригинала. Обычная проверка даёт неполный ответ. Он начинает собирать связный пакет, который покажет Максу в 2040-м.</w:t>
       </w:r>
     </w:p>
     <w:p>
@@ -932,7 +932,7 @@
         <w:jc w:val="both"/>
       </w:pPr>
       <w:r>
-        <w:t>41. «Список». Лев сводит полный каталог охраны, видео, платежи и собственную неверную приёмку. Ева помогает сохранить материал, понимая, что часть подписей её.</w:t>
+        <w:t>41. «Список». Лев сводит полный каталог охраны, видео, платежи и документы с формально допустимыми, но использованными против VELT разрешениями. Ева помогает сохранить материал, понимая, что часть подписей её.</w:t>
       </w:r>
     </w:p>
     <w:p>
@@ -940,7 +940,7 @@
         <w:jc w:val="both"/>
       </w:pPr>
       <w:r>
-        <w:t>42. «День без происшествий». Макс получает пакет из пролога. Он не меняет режим доступа и играет неведение перед Романом, чтобы не выдать Льва. Дома Анна распознаёт ложь в конкретной бытовой детали.</w:t>
+        <w:t>42. «День без происшествий». Лев передаёт Максу полный пакет в 2040 году. Эта сцена происходит впервые, не повторяет пролог. Он не меняет режим доступа и играет неведение перед Романом, чтобы не выдать Льва. Дома Анна распознаёт ложь в конкретной бытовой детали.</w:t>
       </w:r>
     </w:p>
     <w:p>
@@ -988,7 +988,7 @@
         <w:jc w:val="both"/>
       </w:pPr>
       <w:r>
-        <w:t>48. «Цена спасения». Макс признаёт полное содержание раннего договора. Лев понимает, что благодарность десятилетиями мешала ему задавать вопросы. Их разрыв происходит без внезапной драки.</w:t>
+        <w:t>48. «Цена спасения». Макс разбирает с Львом договор главы 30 и позднее расширение доступа, которого не проверил. Нина передаёт проверку Марка другому юристу; её скрытые отношения становятся известны. Лев понимает, что благодарность десятилетиями мешала ему задавать вопросы. Их разрыв происходит без внезапной драки.</w:t>
       </w:r>
     </w:p>
     <w:p>
@@ -996,7 +996,7 @@
         <w:jc w:val="both"/>
       </w:pPr>
       <w:r>
-        <w:t>49. «Сын». Роман пытается купить молчание расходами на лечение сына. Сын слышит разговор и требует не прикрываться им. Роман решает свидетельствовать, но не получает прощения.</w:t>
+        <w:t>49. «Сын». Роман пытается оправдать преступные платежи лечением сына. Взрослый сын, чьи игры и лечение читатель помнит с первой части, отказывается быть оправданием. Сын слышит разговор и требует не прикрываться им. Роман решает свидетельствовать, но не получает прощения.</w:t>
       </w:r>
     </w:p>
     <w:p>
@@ -1076,7 +1076,7 @@
         <w:jc w:val="both"/>
       </w:pPr>
       <w:r>
-        <w:t>59. «Ни у кого одного». Герои разделяют хранение копий и доступ по правилам, согласованным со следствием. Лев говорит Вере полную правду, не требуя возвращения.</w:t>
+        <w:t>59. «Ни у кого одного». Герои разделяют хранение копий и доступ по правилам, согласованным со следствием. Лев говорит Вере полную правду, не требуя возвращения. Мила и Алекс выбирают сотрудничать со следствием, хотя их прежнее доверие разрушено. Соня предупреждает Кирилла только о риске для него, не сливая материалы дела.</w:t>
       </w:r>
     </w:p>
     <w:p>
@@ -1132,7 +1132,7 @@
         <w:jc w:val="both"/>
       </w:pPr>
       <w:r>
-        <w:t>64. «Квартира Павла». Семья Павла показана живой, без предзнаменования смерти. Мальчик собирает школьную сумку. Читатель получает цену будущего отсутствия.</w:t>
+        <w:t>64. «Квартира Павла». Семья Павла показана живой, без предзнаменования смерти. Кирилл, родившийся в 2013 году, собирается на работу. Он любит Соню, но не женат на ней и живёт отдельно от неё. Семья показана до исчезновения; преступная роль родителей не вменяется сыну. Читатель получает цену будущего отсутствия.</w:t>
       </w:r>
     </w:p>
     <w:p>
@@ -1188,7 +1188,7 @@
         <w:jc w:val="both"/>
       </w:pPr>
       <w:r>
-        <w:t>71. «Накрытые столы». Проверка домов и семей показывает оставленные вещи, машины, одежду и еду. Живых и мёртвых не находят. Никакая одна нетронутая чашка не доказывает сверхъестественное событие; сила сцены — в совокупности несовместимых бытовых следов.</w:t>
+        <w:t>71. «Накрытые столы». Проверка домов и семей показывает оставленные вещи, машины, одежду и еду. Живых и мёртвых не находят. Соня теряет Кирилла без возможности узнать, что с ним. Она не исчезает: не работает в организации, не входит в хозяйство Павла, живёт отдельно. Их договорённость встретиться остаётся неисполненной, не даёт подтверждённой вести. Никакая одна нетронутая чашка не доказывает сверхъестественное событие; сила сцены — в совокупности несовместимых бытовых следов.</w:t>
       </w:r>
     </w:p>
     <w:p>
@@ -1196,7 +1196,7 @@
         <w:jc w:val="both"/>
       </w:pPr>
       <w:r>
-        <w:t>72. «Вернуть владельцу». Начинается медленная идентификация и возвращение оригиналов. Ева получает доказанное восстановление имени Дэна в одной разработке. Это не воскресение и не полное оправдание каждого его поступка.</w:t>
+        <w:t>72. «Вернуть владельцу». Начинается медленная идентификация и возвращение оригиналов. Ева получает доказанное восстановление имени Дэна в одной разработке. Алекс участвует в возвращении работ прежним авторам; Мила оценивает поступки, не обещания. Это не воскресение и не полное оправдание каждого его поступка.</w:t>
       </w:r>
     </w:p>
     <w:p>
@@ -1204,7 +1204,7 @@
         <w:jc w:val="both"/>
       </w:pPr>
       <w:r>
-        <w:t>73. «После шума». Переход к 2043–2044 годам через обычную жизнь компании. Заканчиваются подготовленные продукты. Анна возвращается к Максу на собственных условиях, а Эмма признаёт отсутствие подтверждённых следов.</w:t>
+        <w:t>73. «После шума». Переход к 2043–2044 годам через обычную жизнь компании. Заканчиваются подготовленные продукты. Анна начинает встречаться с Максом заново, проверяя бытовые договорённости; возвращение не объявляется одним вечером, а Эмма признаёт отсутствие подтверждённых следов.</w:t>
       </w:r>
     </w:p>
     <w:p>
@@ -1252,7 +1252,7 @@
         <w:jc w:val="both"/>
       </w:pPr>
       <w:r>
-        <w:t>79. «У воды». Макс и Анна, уже живущие на покое после сделки 2052 года, возвращаются к тихому распорядку после пережитого банкротства. Лев и Вера приезжают в гости без деловой папки. Ева смеётся во время маленькой домашней поломки и не должна за это извиняться перед памятью Дэна. Начало съёмок через полгода после банкротства упоминается коротким разговором о согласии на чужую версию прошлого.</w:t>
+        <w:t>79. «У воды». Макс и Анна, уже живущие на покое после сделки 2052 года, возвращаются к тихому распорядку после пережитого банкротства. Лев и Вера приезжают в гости без деловой папки. Ева приезжает с Егором, с которым сближалась в течение последних лет, и впервые смеётся при старых друзьях без оправдания перед памятью Дэна. Соня живёт дальше, не получив ответа о Кирилле. Начало съёмок через полгода после банкротства упоминается коротким разговором о согласии на чужую версию прошлого.</w:t>
       </w:r>
     </w:p>
     <w:p>
@@ -1364,7 +1364,7 @@
         <w:jc w:val="both"/>
       </w:pPr>
       <w:r>
-        <w:t>Исторические линейки: VELT Nova, VELT Tab, VELT ARC, VELT Station, VELT Pulse, VELT Echo, VELT Fold, VELT Vision, VELT AERO, VELT SPECTRA. Названия более ранних отдельных моделей и поколений в источнике не установлены. Поэтому в прологе 2040 года Лев использует VELT Nova без подзаголовка ETERNITY, а Макс работает за VELT Station без OMEGA. Финальные подзаголовки относятся к выпуску 2052 года и не появляются на устройствах раньше.</w:t>
+        <w:t>Исторические линейки: VELT Nova, VELT Tab, VELT ARC, VELT Station, VELT Pulse, VELT Echo, VELT Fold, VELT Vision, VELT AERO, VELT SPECTRA. Названия более ранних отдельных моделей и поколений в источнике не установлены. В сценах 2040 года Лев может использовать VELT Nova без ETERNITY, а Макс — VELT Station без OMEGA. Пролог новой версии происходит перед открытием мастерской, смартфонов VELT в нём нет. Финальные подзаголовки относятся к выпуску 2052 года и не появляются на устройствах раньше.</w:t>
       </w:r>
     </w:p>
     <w:p>
@@ -1396,6 +1396,62 @@
         <w:pStyle w:val="Heading1"/>
       </w:pPr>
       <w:r>
+        <w:t>Любовные линии второй четвёртой частей</w:t>
+      </w:r>
+    </w:p>
+    <w:p>
+      <w:pPr>
+        <w:jc w:val="both"/>
+      </w:pPr>
+      <w:r>
+        <w:t>Мила и Алекс. Оба взрослые к знакомству; Алекс родился в 2008 году. Он инженер бывшей Pear, она развивается в архивном деле вне компании отца. Влечение связано с реальным интересом к работе друг друга, затем конфликт касается присвоенного авторства. Алекс признаёт собственное решение, которое проще было свалить на начальство. Примирение возможно после показаний и возвращения работ; свадьба не обязательная награда за честность.</w:t>
+      </w:r>
+    </w:p>
+    <w:p>
+      <w:pPr>
+        <w:jc w:val="both"/>
+      </w:pPr>
+      <w:r>
+        <w:t>Нина и Марк. Зрелая скрытая связь начинается до подозрений против охраны. Секретность перестаёт быть частным делом, когда Нине нужно проверять человека, с которым она близка. Она раскрывает конфликт и передаёт его независимому специалисту. Марк не получает оправдания через любовь; их новый совместный быт в четвёртой части требует жить без взаимного спасения должностями.</w:t>
+      </w:r>
+    </w:p>
+    <w:p>
+      <w:pPr>
+        <w:jc w:val="both"/>
+      </w:pPr>
+      <w:r>
+        <w:t>Макс, Анна и Ася. Ася — самостоятельная взрослая организатор отраслевых встреч, не сотрудница с зависимостью от Макса. В период разъезда Макс скрывает эмоциональную близость и перестаёт замечать её границу. Анна узнаёт от него, а не через постановочную фотографию. Его ответственность сохраняется без демонизации Аси. Возвращение к Анне строится на многих выполненных обещаниях, включая право Анны не возвращаться.</w:t>
+      </w:r>
+    </w:p>
+    <w:p>
+      <w:pPr>
+        <w:jc w:val="both"/>
+      </w:pPr>
+      <w:r>
+        <w:t>Соня и Кирилл. Кирилл родился в 2013-м, Соня в 2014-м; знакомятся взрослыми в конце 2030-х, к 2042-му им двадцать девять и двадцать восемь. Любовь не даёт доступа к закрытому расследованию. Он зависит от семьи Павла, но не доказанный преступник; она не должна пожертвовать им ради драматической эффектности. После исчезновения подтверждённого сообщения, тела и следа нет до 2057 года. Жизнь Сони продолжается без авторского обещания новой встречи.</w:t>
+      </w:r>
+    </w:p>
+    <w:p>
+      <w:pPr>
+        <w:jc w:val="both"/>
+      </w:pPr>
+      <w:r>
+        <w:t>Ева и Егор. Егор — знакомый по обычному делу в спокойные годы четвёртой части. Их близость развивается через несколько встреч и отказов, спустя годы после смерти Дэна. У него своя биография, он не повторяет шутки погибшего. Ева сама выбирает, что рассказывать о прошлом и когда знакомить его с друзьями.</w:t>
+      </w:r>
+    </w:p>
+    <w:p>
+      <w:pPr>
+        <w:jc w:val="both"/>
+      </w:pPr>
+      <w:r>
+        <w:t>Лев и Вера остаются центральной любовной линией без обязательного треугольника. Риск, скрытый ради защиты, разрушает доверие сильнее выдуманной измены. Восстановление включает конкретное время, заботу и право на отдельные решения.</w:t>
+      </w:r>
+    </w:p>
+    <w:p>
+      <w:pPr>
+        <w:pStyle w:val="Heading1"/>
+      </w:pPr>
+      <w:r>
         <w:t>Правила продолжения</w:t>
       </w:r>
     </w:p>
@@ -1421,6 +1477,30 @@
       </w:pPr>
       <w:r>
         <w:t>Юмор — часть отношений героев: Дэн придумывает нелепые объяснения своим промахам, Ева отвечает сухо и точно, Макс невольно тащит работу на дружеский ужин, Лев замечает бытовые несоответствия. Не делать всех одинаковыми остряками. После известия о смерти, в сценах горя и опасности не вставлять шутку по механическому расписанию. Трагедия оставляет практические и эмоциональные последствия через много глав. Напряжение строится на меняющемся смысле старых улик, неполной осведомлённости и выборе с реальной ценой. Основной драматический пик — третья часть, а не ранняя череда случайных смертей.</w:t>
+      </w:r>
+    </w:p>
+    <w:p>
+      <w:pPr>
+        <w:pStyle w:val="Heading1"/>
+      </w:pPr>
+      <w:r>
+        <w:t>Редакция от 21 октября 2026 года</w:t>
+      </w:r>
+    </w:p>
+    <w:p>
+      <w:pPr>
+        <w:jc w:val="both"/>
+      </w:pPr>
+      <w:r>
+        <w:t>Переработан весь существовавший блок, а не только начало: новый пролог; заново написаны главы 3–6 и 9; изменены линии 7–14, устранены связанные с ранней подменой отсылки; добавлены главы 15–20 и сцены семейной жизни. Первая часть завершена как текущая редакция двадцати глав. Части 2–4 существуют в подробном плане, художественные главы 21–80 пока не написаны. Ранние рассказы о странице 12, белой коробке, приёмке ради зарплаты и согласии неизвестного автора принадлежат старой версии и не должны возвращаться без нового редакторского решения.</w:t>
+      </w:r>
+    </w:p>
+    <w:p>
+      <w:pPr>
+        <w:jc w:val="both"/>
+      </w:pPr>
+      <w:r>
+        <w:t>Прочитаны страницы 1–40 каждой из двух заданных книг на Loveread, с переходом по отдельным адресам страниц. Усвоены общие приёмы ясной сцены и диалога, без копирования текста, образов, событий или авторской манеры. Рабочие тексты референсов в читательские файлы и сайт не включаются.</w:t>
       </w:r>
     </w:p>
     <w:sectPr>

</xml_diff>

<commit_message>
Publish VELT part two and colored publication status badges
</commit_message>
<xml_diff>
--- a/downloads/VELT_bible.docx
+++ b/downloads/VELT_bible.docx
@@ -1492,7 +1492,7 @@
         <w:jc w:val="both"/>
       </w:pPr>
       <w:r>
-        <w:t>Переработан весь существовавший блок, а не только начало: новый пролог; заново написаны главы 3–6 и 9; изменены линии 7–14, устранены связанные с ранней подменой отсылки; добавлены главы 15–20 и сцены семейной жизни. Первая часть завершена как текущая редакция двадцати глав. Части 2–4 существуют в подробном плане, художественные главы 21–80 пока не написаны. Ранние рассказы о странице 12, белой коробке, приёмке ради зарплаты и согласии неизвестного автора принадлежат старой версии и не должны возвращаться без нового редакторского решения.</w:t>
+        <w:t>Переработан весь существовавший блок, а не только начало: новый пролог; заново написаны главы 3–6 и 9; изменены линии 7–14, устранены связанные с ранней подменой отсылки; добавлены главы 15–20 и сцены семейной жизни. Первая часть завершена как текущая редакция двадцати глав. Вторая часть также написана: главы 21–40. Части 3–4 пока существуют в подробном плане; главы 41–80 ещё не написаны. Ранние рассказы о странице 12, белой коробке, приёмке ради зарплаты и согласии неизвестного автора принадлежат старой версии и не должны возвращаться без нового редакторского решения.</w:t>
       </w:r>
     </w:p>
     <w:p>
@@ -1501,6 +1501,22 @@
       </w:pPr>
       <w:r>
         <w:t>Прочитаны страницы 1–40 каждой из двух заданных книг на Loveread, с переходом по отдельным адресам страниц. Усвоены общие приёмы ясной сцены и диалога, без копирования текста, образов, событий или авторской манеры. Рабочие тексты референсов в читательские файлы и сайт не включаются.</w:t>
+      </w:r>
+    </w:p>
+    <w:p>
+      <w:pPr>
+        <w:pStyle w:val="Heading1"/>
+      </w:pPr>
+      <w:r>
+        <w:t>Состояние после второй части</w:t>
+      </w:r>
+    </w:p>
+    <w:p>
+      <w:pPr>
+        <w:jc w:val="both"/>
+      </w:pPr>
+      <w:r>
+        <w:t>Написаны все двадцать глав второй части, 21–40. Действие прошло от большого спроса 2026 года до конца 2039-го. История Антона связана с NORD через Сэма. Разобранные передачи не дают Максу подтверждённого знания о системе краж. Лев заканчивает независимую проверку пакета, который передаст в 2040-м. Детектив ещё не нанят. Мать Льва умерла естественной смертью. Дэн жив. Нина раскрыла отношения с Марком, его проступок проверяет другой юрист. Анна живёт отдельно, Макс признал эмоциональную связь с Асей. Мила и Алекс не расстались окончательно, но их доверие нарушено его ложным подтверждением источника. Соня и Кирилл встречаются взрослыми и живут отдельно; их семьи ещё не знают связи с преступной сетью. Подлинники и люди не найдены в пустом офисе: эта сцена строго остаётся в главе 70.</w:t>
       </w:r>
     </w:p>
     <w:sectPr>

</xml_diff>